<commit_message>
chore: commit remaining working tree changes
- planning artifacts (verification, UAT, summaries)
- style cloner fixes
- header/run/properties/opc fixes
- defaults/ cleanup
- testdata roundtrip update
</commit_message>
<xml_diff>
--- a/testdata/roundtrip/rich-content-story.docx
+++ b/testdata/roundtrip/rich-content-story.docx
@@ -1,6 +1,6 @@
 
 <file path=word/document.xml><?xml version="1.0" encoding="utf-8"?>
-<w:document xmlns:w="http://schemas.openxmlformats.org/wordprocessingml/2006/main" xmlns:wp="http://schemas.openxmlformats.org/drawingml/2006/wordprocessingDrawing" xmlns:a="http://schemas.openxmlformats.org/drawingml/2006/main" xmlns:r="http://schemas.openxmlformats.org/officeDocument/2006/relationships">
+<w:document xmlns:a="http://schemas.openxmlformats.org/drawingml/2006/main" xmlns:r="http://schemas.openxmlformats.org/officeDocument/2006/relationships" xmlns:w="http://schemas.openxmlformats.org/wordprocessingml/2006/main" xmlns:wp="http://schemas.openxmlformats.org/drawingml/2006/wordprocessingDrawing">
   <w:body>
     <w:p>
       <w:pPr>
@@ -111,85 +111,6 @@
             </a:graphic>
           </wp:inline>
         </w:drawing>
-      </w:r>
-    </w:p>
-    <w:p/>
-    <w:p>
-      <w:pPr>
-        <w:pStyle w:val="Heading2"/>
-      </w:pPr>
-      <w:r>
-        <w:t>Key Takeaways</w:t>
-      </w:r>
-    </w:p>
-    <w:p>
-      <w:pPr>
-        <w:numPr>
-          <w:ilvl w:val="0"/>
-          <w:numId w:val="1"/>
-        </w:numPr>
-      </w:pPr>
-      <w:r>
-        <w:t>Always check for nil</w:t>
-      </w:r>
-    </w:p>
-    <w:p>
-      <w:pPr>
-        <w:numPr>
-          <w:ilvl w:val="0"/>
-          <w:numId w:val="1"/>
-        </w:numPr>
-      </w:pPr>
-      <w:r>
-        <w:t>Log generously</w:t>
-      </w:r>
-    </w:p>
-    <w:p>
-      <w:pPr>
-        <w:numPr>
-          <w:ilvl w:val="0"/>
-          <w:numId w:val="1"/>
-        </w:numPr>
-      </w:pPr>
-      <w:r>
-        <w:t>Trust the stack trace</w:t>
-      </w:r>
-    </w:p>
-    <w:p>
-      <w:pPr>
-        <w:numPr>
-          <w:ilvl w:val="0"/>
-          <w:numId w:val="1"/>
-        </w:numPr>
-      </w:pPr>
-      <w:r>
-        <w:t>Sleep on hard problems</w:t>
-      </w:r>
-    </w:p>
-    <w:p>
-      <w:pPr>
-        <w:pStyle w:val="Normal"/>
-      </w:pPr>
-      <w:r>
-        <w:t xml:space="preserve">You can read more at </w:t>
-      </w:r>
-      <w:hyperlink r:id="rId10">
-        <w:r>
-          <w:rPr>
-            <w:u w:val="single"/>
-            <w:color w:val="0563C1"/>
-          </w:rPr>
-          <w:t>Ada's Blog</w:t>
-        </w:r>
-      </w:hyperlink>
-    </w:p>
-    <w:p/>
-    <w:p>
-      <w:pPr>
-        <w:pStyle w:val="Heading1"/>
-      </w:pPr>
-      <w:r>
-        <w:t>Fin</w:t>
       </w:r>
     </w:p>
     <w:tbl>
@@ -298,6 +219,85 @@
         </w:tc>
       </w:tr>
     </w:tbl>
+    <w:p/>
+    <w:p>
+      <w:pPr>
+        <w:pStyle w:val="Heading2"/>
+      </w:pPr>
+      <w:r>
+        <w:t>Key Takeaways</w:t>
+      </w:r>
+    </w:p>
+    <w:p>
+      <w:pPr>
+        <w:numPr>
+          <w:ilvl w:val="0"/>
+          <w:numId w:val="1"/>
+        </w:numPr>
+      </w:pPr>
+      <w:r>
+        <w:t>Always check for nil</w:t>
+      </w:r>
+    </w:p>
+    <w:p>
+      <w:pPr>
+        <w:numPr>
+          <w:ilvl w:val="0"/>
+          <w:numId w:val="1"/>
+        </w:numPr>
+      </w:pPr>
+      <w:r>
+        <w:t>Log generously</w:t>
+      </w:r>
+    </w:p>
+    <w:p>
+      <w:pPr>
+        <w:numPr>
+          <w:ilvl w:val="0"/>
+          <w:numId w:val="1"/>
+        </w:numPr>
+      </w:pPr>
+      <w:r>
+        <w:t>Trust the stack trace</w:t>
+      </w:r>
+    </w:p>
+    <w:p>
+      <w:pPr>
+        <w:numPr>
+          <w:ilvl w:val="0"/>
+          <w:numId w:val="1"/>
+        </w:numPr>
+      </w:pPr>
+      <w:r>
+        <w:t>Sleep on hard problems</w:t>
+      </w:r>
+    </w:p>
+    <w:p>
+      <w:pPr>
+        <w:pStyle w:val="Normal"/>
+      </w:pPr>
+      <w:r>
+        <w:t xml:space="preserve">You can read more at </w:t>
+      </w:r>
+      <w:hyperlink r:id="rId10">
+        <w:r>
+          <w:rPr>
+            <w:u w:val="single"/>
+            <w:color w:val="0563C1"/>
+          </w:rPr>
+          <w:t>Ada's Blog</w:t>
+        </w:r>
+      </w:hyperlink>
+    </w:p>
+    <w:p/>
+    <w:p>
+      <w:pPr>
+        <w:pStyle w:val="Heading1"/>
+      </w:pPr>
+      <w:r>
+        <w:t>Fin</w:t>
+      </w:r>
+    </w:p>
     <w:sectPr>
       <w:pgSz w:w="12240" w:h="15840"/>
       <w:pgMar w:top="1440" w:right="1440" w:bottom="1440" w:left="1440"/>

</xml_diff>

<commit_message>
chore(testdata): refresh rich-content fixture with canonical numbering
</commit_message>
<xml_diff>
--- a/testdata/roundtrip/rich-content-story.docx
+++ b/testdata/roundtrip/rich-content-story.docx
@@ -342,56 +342,95 @@
 
 <file path=word/numbering.xml><?xml version="1.0" encoding="utf-8"?>
 <w:numbering xmlns:w="http://schemas.openxmlformats.org/wordprocessingml/2006/main">
+  <w:abstractNum w:abstractNumId="0">
+    <w:nsid w:val="20000000"/>
+    <w:multiLevelType w:val="hybridMultilevel"/>
+    <w:tmpl w:val="40000000"/>
+    <w:lvl w:ilvl="0">
+      <w:start w:val="1"/>
+      <w:numFmt w:val="bullet"/>
+      <w:lvlText w:val="•"/>
+      <w:lvlJc w:val="left"/>
+      <w:pPr>
+        <w:ind w:left="720" w:hanging="360"/>
+      </w:pPr>
+    </w:lvl>
+    <w:lvl w:ilvl="1">
+      <w:start w:val="1"/>
+      <w:numFmt w:val="bullet"/>
+      <w:lvlText w:val="◦"/>
+      <w:lvlJc w:val="left"/>
+      <w:pPr>
+        <w:ind w:left="1440" w:hanging="360"/>
+      </w:pPr>
+    </w:lvl>
+    <w:lvl w:ilvl="2">
+      <w:start w:val="1"/>
+      <w:numFmt w:val="bullet"/>
+      <w:lvlText w:val="▪"/>
+      <w:lvlJc w:val="left"/>
+      <w:pPr>
+        <w:ind w:left="2160" w:hanging="360"/>
+      </w:pPr>
+    </w:lvl>
+    <w:lvl w:ilvl="3">
+      <w:start w:val="1"/>
+      <w:numFmt w:val="bullet"/>
+      <w:lvlText w:val="▫"/>
+      <w:lvlJc w:val="left"/>
+      <w:pPr>
+        <w:ind w:left="2880" w:hanging="360"/>
+      </w:pPr>
+    </w:lvl>
+    <w:lvl w:ilvl="4">
+      <w:start w:val="1"/>
+      <w:numFmt w:val="bullet"/>
+      <w:lvlText w:val="•"/>
+      <w:lvlJc w:val="left"/>
+      <w:pPr>
+        <w:ind w:left="3600" w:hanging="360"/>
+      </w:pPr>
+    </w:lvl>
+    <w:lvl w:ilvl="5">
+      <w:start w:val="1"/>
+      <w:numFmt w:val="bullet"/>
+      <w:lvlText w:val="◦"/>
+      <w:lvlJc w:val="left"/>
+      <w:pPr>
+        <w:ind w:left="4320" w:hanging="360"/>
+      </w:pPr>
+    </w:lvl>
+    <w:lvl w:ilvl="6">
+      <w:start w:val="1"/>
+      <w:numFmt w:val="bullet"/>
+      <w:lvlText w:val="▪"/>
+      <w:lvlJc w:val="left"/>
+      <w:pPr>
+        <w:ind w:left="5040" w:hanging="360"/>
+      </w:pPr>
+    </w:lvl>
+    <w:lvl w:ilvl="7">
+      <w:start w:val="1"/>
+      <w:numFmt w:val="bullet"/>
+      <w:lvlText w:val="▫"/>
+      <w:lvlJc w:val="left"/>
+      <w:pPr>
+        <w:ind w:left="5760" w:hanging="360"/>
+      </w:pPr>
+    </w:lvl>
+    <w:lvl w:ilvl="8">
+      <w:start w:val="1"/>
+      <w:numFmt w:val="bullet"/>
+      <w:lvlText w:val="•"/>
+      <w:lvlJc w:val="left"/>
+      <w:pPr>
+        <w:ind w:left="6480" w:hanging="360"/>
+      </w:pPr>
+    </w:lvl>
+  </w:abstractNum>
   <w:num w:numId="1">
     <w:abstractNumId w:val="0"/>
   </w:num>
-  <w:abstractNum w:abstractNumId="0">
-    <w:lvl w:ilvl="0">
-      <w:numFmt w:val="bullet"/>
-      <w:lvlText w:val="•"/>
-      <w:start w:val="1"/>
-    </w:lvl>
-    <w:lvl w:ilvl="1">
-      <w:numFmt w:val="bullet"/>
-      <w:lvlText w:val="◦"/>
-      <w:start w:val="1"/>
-    </w:lvl>
-    <w:lvl w:ilvl="2">
-      <w:numFmt w:val="bullet"/>
-      <w:lvlText w:val="▪"/>
-      <w:start w:val="1"/>
-    </w:lvl>
-    <w:lvl w:ilvl="3">
-      <w:numFmt w:val="bullet"/>
-      <w:lvlText w:val="▫"/>
-      <w:start w:val="1"/>
-    </w:lvl>
-    <w:lvl w:ilvl="4">
-      <w:numFmt w:val="bullet"/>
-      <w:lvlText w:val="•"/>
-      <w:start w:val="1"/>
-    </w:lvl>
-    <w:lvl w:ilvl="5">
-      <w:numFmt w:val="bullet"/>
-      <w:lvlText w:val="◦"/>
-      <w:start w:val="1"/>
-    </w:lvl>
-    <w:lvl w:ilvl="6">
-      <w:numFmt w:val="bullet"/>
-      <w:lvlText w:val="▪"/>
-      <w:start w:val="1"/>
-    </w:lvl>
-    <w:lvl w:ilvl="7">
-      <w:numFmt w:val="bullet"/>
-      <w:lvlText w:val="▫"/>
-      <w:start w:val="1"/>
-    </w:lvl>
-    <w:lvl w:ilvl="8">
-      <w:numFmt w:val="bullet"/>
-      <w:lvlText w:val="•"/>
-      <w:start w:val="1"/>
-    </w:lvl>
-  </w:abstractNum>
 </w:numbering>
 </file>
 

</xml_diff>